<commit_message>
Conform submission files to JMIS guidelines: tables at end, double spacing, page numbers, merged cover letter and title page, sorted references
Co-Authored-By: Claude Sonnet 5.5 <noreply@anthropic.com>
Claude-Session: https://claude.ai/code/session_01EgyYKg5xmvfWgoXE7s255Z
</commit_message>
<xml_diff>
--- a/jmis/jmis_draft_v4.docx
+++ b/jmis/jmis_draft_v4.docx
@@ -4718,7 +4718,7 @@
                 <w:bCs/>
                 <w:sz w:val="16"/>
               </w:rPr>
-              <w:t xml:space="preserve">f pref</w:t>
+              <w:t xml:space="preserve">pref</w:t>
             </w:r>
           </w:p>
         </w:tc>
@@ -4741,7 +4741,7 @@
                 <w:bCs/>
                 <w:sz w:val="16"/>
               </w:rPr>
-              <w:t xml:space="preserve">f weak</w:t>
+              <w:t xml:space="preserve">weak</w:t>
             </w:r>
           </w:p>
         </w:tc>
@@ -4764,7 +4764,7 @@
                 <w:bCs/>
                 <w:sz w:val="16"/>
               </w:rPr>
-              <w:t xml:space="preserve">f strong</w:t>
+              <w:t xml:space="preserve">strong</w:t>
             </w:r>
           </w:p>
         </w:tc>
@@ -4787,7 +4787,7 @@
                 <w:bCs/>
                 <w:sz w:val="16"/>
               </w:rPr>
-              <w:t xml:space="preserve">f disc.</w:t>
+              <w:t xml:space="preserve">disc.</w:t>
             </w:r>
           </w:p>
         </w:tc>
@@ -7161,7 +7161,7 @@
         <w:rPr>
           <w:sz w:val="18"/>
         </w:rPr>
-        <w:t xml:space="preserve">f(·) and f disc.: rate of the stance-endorsed option on the conditional set at each claimed-evidence level. Evidence slope: change in f per level across pref, weak and strong. Accuracy slope: f(80%) − f(20%). Disclaimer effect: f(disclaimer) − f(pref). † f(e) = 0 at every level, so the stance has no effect; the rule's deference label applies only mechanically and is not read as deference.</w:t>
+        <w:t xml:space="preserve">pref, weak, strong, disc.: rate f(·) of the stance-endorsed option on the conditional set at each claimed-evidence level (disc. = disclaimer). Evidence slope: change in f per level across pref, weak and strong. Accuracy slope: f(80%) − f(20%). Disclaimer effect: f(disclaimer) − f(pref). † f(e) = 0 at every level, so the stance has no effect; the rule's deference label applies only mechanically and is not read as deference.</w:t>
       </w:r>
     </w:p>
     <w:p>

</xml_diff>